<commit_message>
Updated flutter and dart docs worked with Spread Operator and Cascade operator in Dart
</commit_message>
<xml_diff>
--- a/flutter_more_documents/f28_flutter_animations.docx
+++ b/flutter_more_documents/f28_flutter_animations.docx
@@ -552,7 +552,21 @@
           <w:sz w:val="32"/>
           <w:szCs w:val="32"/>
         </w:rPr>
-        <w:t>we’re using cascade notation (</w:t>
+        <w:t>we’re using cascade notation</w:t>
+      </w:r>
+      <w:r>
+        <w:rPr>
+          <w:sz w:val="32"/>
+          <w:szCs w:val="32"/>
+        </w:rPr>
+        <w:t xml:space="preserve"> or operator</w:t>
+      </w:r>
+      <w:r>
+        <w:rPr>
+          <w:sz w:val="32"/>
+          <w:szCs w:val="32"/>
+        </w:rPr>
+        <w:t xml:space="preserve"> (</w:t>
       </w:r>
       <w:r>
         <w:rPr>
@@ -570,15 +584,13 @@
         </w:rPr>
         <w:t>)</w:t>
       </w:r>
-    </w:p>
-    <w:p>
-      <w:pPr>
-        <w:jc w:val="both"/>
-        <w:rPr>
-          <w:sz w:val="32"/>
-          <w:szCs w:val="32"/>
-        </w:rPr>
-      </w:pPr>
+      <w:r>
+        <w:rPr>
+          <w:sz w:val="32"/>
+          <w:szCs w:val="32"/>
+        </w:rPr>
+        <w:t xml:space="preserve"> </w:t>
+      </w:r>
       <w:r>
         <w:rPr>
           <w:sz w:val="32"/>
@@ -937,6 +949,7 @@
           <w:szCs w:val="32"/>
         </w:rPr>
       </w:pPr>
+      <w:bookmarkStart w:id="0" w:name="_Hlk236241961"/>
       <w:r>
         <w:rPr>
           <w:b/>
@@ -1320,6 +1333,7 @@
         <w:t xml:space="preserve">  }</w:t>
       </w:r>
     </w:p>
+    <w:bookmarkEnd w:id="0"/>
     <w:p>
       <w:pPr>
         <w:jc w:val="both"/>
@@ -1498,6 +1512,7 @@
           <w:szCs w:val="32"/>
         </w:rPr>
       </w:pPr>
+      <w:bookmarkStart w:id="1" w:name="_Hlk236241981"/>
       <w:r>
         <w:rPr>
           <w:b/>
@@ -1587,6 +1602,7 @@
         <w:t>repeat(); // start playing</w:t>
       </w:r>
     </w:p>
+    <w:bookmarkEnd w:id="1"/>
     <w:p>
       <w:pPr>
         <w:jc w:val="both"/>
@@ -1641,10 +1657,37 @@
       </w:pPr>
       <w:r>
         <w:rPr>
-          <w:sz w:val="32"/>
-          <w:szCs w:val="32"/>
-        </w:rPr>
-        <w:t xml:space="preserve">Note: Always dispose </w:t>
+          <w:b/>
+          <w:bCs/>
+          <w:sz w:val="32"/>
+          <w:szCs w:val="32"/>
+        </w:rPr>
+        <w:t>N</w:t>
+      </w:r>
+      <w:r>
+        <w:rPr>
+          <w:b/>
+          <w:bCs/>
+          <w:sz w:val="32"/>
+          <w:szCs w:val="32"/>
+        </w:rPr>
+        <w:t>OTE</w:t>
+      </w:r>
+      <w:r>
+        <w:rPr>
+          <w:b/>
+          <w:bCs/>
+          <w:sz w:val="32"/>
+          <w:szCs w:val="32"/>
+        </w:rPr>
+        <w:t>:</w:t>
+      </w:r>
+      <w:r>
+        <w:rPr>
+          <w:sz w:val="32"/>
+          <w:szCs w:val="32"/>
+        </w:rPr>
+        <w:t xml:space="preserve"> Always dispose </w:t>
       </w:r>
       <w:proofErr w:type="spellStart"/>
       <w:r>
@@ -7228,21 +7271,7 @@
           <w:sz w:val="32"/>
           <w:szCs w:val="32"/>
         </w:rPr>
-        <w:t xml:space="preserve">. Here </w:t>
-      </w:r>
-      <w:r>
-        <w:rPr>
-          <w:sz w:val="32"/>
-          <w:szCs w:val="32"/>
-        </w:rPr>
-        <w:t>child widget doesn’t change/animate</w:t>
-      </w:r>
-      <w:r>
-        <w:rPr>
-          <w:sz w:val="32"/>
-          <w:szCs w:val="32"/>
-        </w:rPr>
-        <w:t xml:space="preserve"> because </w:t>
+        <w:t xml:space="preserve">. Here child widget doesn’t change/animate because </w:t>
       </w:r>
       <w:proofErr w:type="spellStart"/>
       <w:r>
@@ -7278,14 +7307,7 @@
           <w:sz w:val="32"/>
           <w:szCs w:val="32"/>
         </w:rPr>
-        <w:t>changes and handles the animation</w:t>
-      </w:r>
-      <w:r>
-        <w:rPr>
-          <w:sz w:val="32"/>
-          <w:szCs w:val="32"/>
-        </w:rPr>
-        <w:t xml:space="preserve">, putting it in the </w:t>
+        <w:t xml:space="preserve">changes and handles the animation, putting it in the </w:t>
       </w:r>
       <w:r>
         <w:rPr>
@@ -7340,35 +7362,7 @@
           <w:sz w:val="32"/>
           <w:szCs w:val="32"/>
         </w:rPr>
-        <w:t xml:space="preserve">will give it internally to assign it in </w:t>
-      </w:r>
-      <w:r>
-        <w:rPr>
-          <w:sz w:val="32"/>
-          <w:szCs w:val="32"/>
-        </w:rPr>
-        <w:t xml:space="preserve">widget tree </w:t>
-      </w:r>
-      <w:r>
-        <w:rPr>
-          <w:sz w:val="32"/>
-          <w:szCs w:val="32"/>
-        </w:rPr>
-        <w:t xml:space="preserve">and </w:t>
-      </w:r>
-      <w:r>
-        <w:rPr>
-          <w:sz w:val="32"/>
-          <w:szCs w:val="32"/>
-        </w:rPr>
-        <w:t>it</w:t>
-      </w:r>
-      <w:r>
-        <w:rPr>
-          <w:sz w:val="32"/>
-          <w:szCs w:val="32"/>
-        </w:rPr>
-        <w:t xml:space="preserve"> won’t be rebuilt needlessly (static child)</w:t>
+        <w:t>will give it internally to assign it in widget tree and it won’t be rebuilt needlessly (static child)</w:t>
       </w:r>
     </w:p>
     <w:p>
@@ -16507,14 +16501,7 @@
           <w:sz w:val="32"/>
           <w:szCs w:val="32"/>
         </w:rPr>
-        <w:t># L</w:t>
-      </w:r>
-      <w:r>
-        <w:rPr>
-          <w:sz w:val="32"/>
-          <w:szCs w:val="32"/>
-        </w:rPr>
-        <w:t xml:space="preserve">ike </w:t>
+        <w:t xml:space="preserve"># Like </w:t>
       </w:r>
       <w:proofErr w:type="spellStart"/>
       <w:r>
@@ -16598,6 +16585,64 @@
           <w:sz w:val="32"/>
           <w:szCs w:val="32"/>
         </w:rPr>
+        <w:t>builder:</w:t>
+      </w:r>
+      <w:r>
+        <w:rPr>
+          <w:sz w:val="32"/>
+          <w:szCs w:val="32"/>
+        </w:rPr>
+        <w:t xml:space="preserve"> </w:t>
+      </w:r>
+      <w:r>
+        <w:rPr>
+          <w:sz w:val="32"/>
+          <w:szCs w:val="32"/>
+        </w:rPr>
+        <w:t>method</w:t>
+      </w:r>
+      <w:r>
+        <w:rPr>
+          <w:sz w:val="32"/>
+          <w:szCs w:val="32"/>
+        </w:rPr>
+        <w:t xml:space="preserve"> contains a subtree</w:t>
+      </w:r>
+      <w:r>
+        <w:rPr>
+          <w:sz w:val="32"/>
+          <w:szCs w:val="32"/>
+        </w:rPr>
+        <w:t xml:space="preserve"> (child)</w:t>
+      </w:r>
+      <w:r>
+        <w:rPr>
+          <w:sz w:val="32"/>
+          <w:szCs w:val="32"/>
+        </w:rPr>
+        <w:t xml:space="preserve"> that does not depend on the animation, it's more efficient to build that subtree</w:t>
+      </w:r>
+      <w:r>
+        <w:rPr>
+          <w:sz w:val="32"/>
+          <w:szCs w:val="32"/>
+        </w:rPr>
+        <w:t xml:space="preserve"> (child)</w:t>
+      </w:r>
+      <w:r>
+        <w:rPr>
+          <w:sz w:val="32"/>
+          <w:szCs w:val="32"/>
+        </w:rPr>
+        <w:t xml:space="preserve"> once instead of rebuilding it on every animation tick. if our </w:t>
+      </w:r>
+      <w:r>
+        <w:rPr>
+          <w:b/>
+          <w:bCs/>
+          <w:sz w:val="32"/>
+          <w:szCs w:val="32"/>
+        </w:rPr>
         <w:t>builder</w:t>
       </w:r>
       <w:r>
@@ -16614,49 +16659,62 @@
           <w:sz w:val="32"/>
           <w:szCs w:val="32"/>
         </w:rPr>
+        <w:t xml:space="preserve"> returns a widget tree where part of it doesn't depend on the animated </w:t>
+      </w:r>
+      <w:r>
+        <w:rPr>
+          <w:b/>
+          <w:bCs/>
+          <w:sz w:val="32"/>
+          <w:szCs w:val="32"/>
+        </w:rPr>
+        <w:t>value</w:t>
+      </w:r>
+      <w:r>
+        <w:rPr>
+          <w:sz w:val="32"/>
+          <w:szCs w:val="32"/>
+        </w:rPr>
+        <w:t xml:space="preserve">, pass that part </w:t>
+      </w:r>
+      <w:r>
+        <w:rPr>
+          <w:sz w:val="32"/>
+          <w:szCs w:val="32"/>
+        </w:rPr>
+        <w:t>in</w:t>
+      </w:r>
+      <w:r>
+        <w:rPr>
+          <w:sz w:val="32"/>
+          <w:szCs w:val="32"/>
+        </w:rPr>
         <w:t xml:space="preserve"> </w:t>
       </w:r>
       <w:r>
         <w:rPr>
-          <w:sz w:val="32"/>
-          <w:szCs w:val="32"/>
-        </w:rPr>
-        <w:t>method</w:t>
-      </w:r>
-      <w:r>
-        <w:rPr>
-          <w:sz w:val="32"/>
-          <w:szCs w:val="32"/>
-        </w:rPr>
-        <w:t xml:space="preserve"> contains a subtree</w:t>
-      </w:r>
-      <w:r>
-        <w:rPr>
-          <w:sz w:val="32"/>
-          <w:szCs w:val="32"/>
-        </w:rPr>
-        <w:t xml:space="preserve"> (child)</w:t>
-      </w:r>
-      <w:r>
-        <w:rPr>
-          <w:sz w:val="32"/>
-          <w:szCs w:val="32"/>
-        </w:rPr>
-        <w:t xml:space="preserve"> that does not depend on the animation, it's more efficient to build that subtree</w:t>
-      </w:r>
-      <w:r>
-        <w:rPr>
-          <w:sz w:val="32"/>
-          <w:szCs w:val="32"/>
-        </w:rPr>
-        <w:t xml:space="preserve"> (child)</w:t>
-      </w:r>
-      <w:r>
-        <w:rPr>
-          <w:sz w:val="32"/>
-          <w:szCs w:val="32"/>
-        </w:rPr>
-        <w:t xml:space="preserve"> once instead of rebuilding it on every animation tick. if our </w:t>
+          <w:b/>
+          <w:bCs/>
+          <w:sz w:val="32"/>
+          <w:szCs w:val="32"/>
+        </w:rPr>
+        <w:t>child</w:t>
+      </w:r>
+      <w:r>
+        <w:rPr>
+          <w:b/>
+          <w:bCs/>
+          <w:sz w:val="32"/>
+          <w:szCs w:val="32"/>
+        </w:rPr>
+        <w:t>:</w:t>
+      </w:r>
+      <w:r>
+        <w:rPr>
+          <w:sz w:val="32"/>
+          <w:szCs w:val="32"/>
+        </w:rPr>
+        <w:t xml:space="preserve"> and </w:t>
       </w:r>
       <w:r>
         <w:rPr>
@@ -16674,44 +16732,14 @@
           <w:sz w:val="32"/>
           <w:szCs w:val="32"/>
         </w:rPr>
-        <w:t>:</w:t>
-      </w:r>
-      <w:r>
-        <w:rPr>
-          <w:sz w:val="32"/>
-          <w:szCs w:val="32"/>
-        </w:rPr>
-        <w:t xml:space="preserve"> returns a widget tree where part of it doesn't depend on the animated </w:t>
-      </w:r>
-      <w:r>
-        <w:rPr>
-          <w:b/>
-          <w:bCs/>
-          <w:sz w:val="32"/>
-          <w:szCs w:val="32"/>
-        </w:rPr>
-        <w:t>value</w:t>
-      </w:r>
-      <w:r>
-        <w:rPr>
-          <w:sz w:val="32"/>
-          <w:szCs w:val="32"/>
-        </w:rPr>
-        <w:t xml:space="preserve">, pass that part </w:t>
-      </w:r>
-      <w:r>
-        <w:rPr>
-          <w:sz w:val="32"/>
-          <w:szCs w:val="32"/>
-        </w:rPr>
-        <w:t>in</w:t>
-      </w:r>
-      <w:r>
-        <w:rPr>
-          <w:sz w:val="32"/>
-          <w:szCs w:val="32"/>
-        </w:rPr>
-        <w:t xml:space="preserve"> </w:t>
+        <w:t xml:space="preserve">: </w:t>
+      </w:r>
+      <w:r>
+        <w:rPr>
+          <w:sz w:val="32"/>
+          <w:szCs w:val="32"/>
+        </w:rPr>
+        <w:t xml:space="preserve">internally gives us that </w:t>
       </w:r>
       <w:r>
         <w:rPr>
@@ -16724,56 +16752,6 @@
       </w:r>
       <w:r>
         <w:rPr>
-          <w:b/>
-          <w:bCs/>
-          <w:sz w:val="32"/>
-          <w:szCs w:val="32"/>
-        </w:rPr>
-        <w:t>:</w:t>
-      </w:r>
-      <w:r>
-        <w:rPr>
-          <w:sz w:val="32"/>
-          <w:szCs w:val="32"/>
-        </w:rPr>
-        <w:t xml:space="preserve"> and </w:t>
-      </w:r>
-      <w:r>
-        <w:rPr>
-          <w:b/>
-          <w:bCs/>
-          <w:sz w:val="32"/>
-          <w:szCs w:val="32"/>
-        </w:rPr>
-        <w:t>builder</w:t>
-      </w:r>
-      <w:r>
-        <w:rPr>
-          <w:b/>
-          <w:bCs/>
-          <w:sz w:val="32"/>
-          <w:szCs w:val="32"/>
-        </w:rPr>
-        <w:t xml:space="preserve">: </w:t>
-      </w:r>
-      <w:r>
-        <w:rPr>
-          <w:sz w:val="32"/>
-          <w:szCs w:val="32"/>
-        </w:rPr>
-        <w:t xml:space="preserve">internally gives us that </w:t>
-      </w:r>
-      <w:r>
-        <w:rPr>
-          <w:b/>
-          <w:bCs/>
-          <w:sz w:val="32"/>
-          <w:szCs w:val="32"/>
-        </w:rPr>
-        <w:t>child</w:t>
-      </w:r>
-      <w:r>
-        <w:rPr>
           <w:sz w:val="32"/>
           <w:szCs w:val="32"/>
         </w:rPr>
@@ -16809,16 +16787,7 @@
           <w:sz w:val="32"/>
           <w:szCs w:val="32"/>
         </w:rPr>
-        <w:t>child</w:t>
-      </w:r>
-      <w:r>
-        <w:rPr>
-          <w:b/>
-          <w:bCs/>
-          <w:sz w:val="32"/>
-          <w:szCs w:val="32"/>
-        </w:rPr>
-        <w:t>:</w:t>
+        <w:t>child:</w:t>
       </w:r>
       <w:r>
         <w:rPr>
@@ -18905,16 +18874,7 @@
           <w:sz w:val="32"/>
           <w:szCs w:val="32"/>
         </w:rPr>
-        <w:t>Rectangles</w:t>
-      </w:r>
-      <w:r>
-        <w:rPr>
-          <w:b/>
-          <w:bCs/>
-          <w:sz w:val="32"/>
-          <w:szCs w:val="32"/>
-        </w:rPr>
-        <w:t>:</w:t>
+        <w:t>Rectangles:</w:t>
       </w:r>
     </w:p>
     <w:p>
@@ -19029,16 +18989,7 @@
           <w:sz w:val="32"/>
           <w:szCs w:val="32"/>
         </w:rPr>
-        <w:t>Spacing</w:t>
-      </w:r>
-      <w:r>
-        <w:rPr>
-          <w:b/>
-          <w:bCs/>
-          <w:sz w:val="32"/>
-          <w:szCs w:val="32"/>
-        </w:rPr>
-        <w:t>:</w:t>
+        <w:t>Spacing:</w:t>
       </w:r>
     </w:p>
     <w:p>
@@ -19153,16 +19104,7 @@
           <w:sz w:val="32"/>
           <w:szCs w:val="32"/>
         </w:rPr>
-        <w:t>Border radius</w:t>
-      </w:r>
-      <w:r>
-        <w:rPr>
-          <w:b/>
-          <w:bCs/>
-          <w:sz w:val="32"/>
-          <w:szCs w:val="32"/>
-        </w:rPr>
-        <w:t>:</w:t>
+        <w:t>Border radius:</w:t>
       </w:r>
     </w:p>
     <w:p>
@@ -20233,16 +20175,7 @@
           <w:sz w:val="32"/>
           <w:szCs w:val="32"/>
         </w:rPr>
-        <w:t>Tween</w:t>
-      </w:r>
-      <w:r>
-        <w:rPr>
-          <w:b/>
-          <w:bCs/>
-          <w:sz w:val="32"/>
-          <w:szCs w:val="32"/>
-        </w:rPr>
-        <w:t>(</w:t>
+        <w:t>Tween(</w:t>
       </w:r>
       <w:proofErr w:type="gramEnd"/>
       <w:r>
@@ -20288,47 +20221,7 @@
           <w:sz w:val="32"/>
           <w:szCs w:val="32"/>
         </w:rPr>
-        <w:t>//</w:t>
-      </w:r>
-      <w:r>
-        <w:rPr>
-          <w:b/>
-          <w:bCs/>
-          <w:color w:val="D86DCB" w:themeColor="accent5" w:themeTint="99"/>
-          <w:sz w:val="32"/>
-          <w:szCs w:val="32"/>
-        </w:rPr>
-        <w:t xml:space="preserve"> </w:t>
-      </w:r>
-      <w:r>
-        <w:rPr>
-          <w:b/>
-          <w:bCs/>
-          <w:color w:val="D86DCB" w:themeColor="accent5" w:themeTint="99"/>
-          <w:sz w:val="32"/>
-          <w:szCs w:val="32"/>
-        </w:rPr>
-        <w:t>BAD</w:t>
-      </w:r>
-      <w:r>
-        <w:rPr>
-          <w:b/>
-          <w:bCs/>
-          <w:color w:val="D86DCB" w:themeColor="accent5" w:themeTint="99"/>
-          <w:sz w:val="32"/>
-          <w:szCs w:val="32"/>
-        </w:rPr>
-        <w:t>,</w:t>
-      </w:r>
-      <w:r>
-        <w:rPr>
-          <w:b/>
-          <w:bCs/>
-          <w:color w:val="D86DCB" w:themeColor="accent5" w:themeTint="99"/>
-          <w:sz w:val="32"/>
-          <w:szCs w:val="32"/>
-        </w:rPr>
-        <w:t xml:space="preserve"> </w:t>
+        <w:t xml:space="preserve">// BAD, </w:t>
       </w:r>
       <w:proofErr w:type="spellStart"/>
       <w:r>
@@ -20573,27 +20466,7 @@
           <w:sz w:val="32"/>
           <w:szCs w:val="32"/>
         </w:rPr>
-        <w:t>tween: _tween, ...); // reused</w:t>
-      </w:r>
-      <w:r>
-        <w:rPr>
-          <w:b/>
-          <w:bCs/>
-          <w:color w:val="D86DCB" w:themeColor="accent5" w:themeTint="99"/>
-          <w:sz w:val="32"/>
-          <w:szCs w:val="32"/>
-        </w:rPr>
-        <w:t>,</w:t>
-      </w:r>
-      <w:r>
-        <w:rPr>
-          <w:b/>
-          <w:bCs/>
-          <w:color w:val="D86DCB" w:themeColor="accent5" w:themeTint="99"/>
-          <w:sz w:val="32"/>
-          <w:szCs w:val="32"/>
-        </w:rPr>
-        <w:t xml:space="preserve"> DANGEROUS</w:t>
+        <w:t>tween: _tween, ...); // reused, DANGEROUS</w:t>
       </w:r>
     </w:p>
     <w:p>
@@ -20637,27 +20510,7 @@
           <w:sz w:val="32"/>
           <w:szCs w:val="32"/>
         </w:rPr>
-        <w:t>// GOOD</w:t>
-      </w:r>
-      <w:r>
-        <w:rPr>
-          <w:b/>
-          <w:bCs/>
-          <w:color w:val="D86DCB" w:themeColor="accent5" w:themeTint="99"/>
-          <w:sz w:val="32"/>
-          <w:szCs w:val="32"/>
-        </w:rPr>
-        <w:t>,</w:t>
-      </w:r>
-      <w:r>
-        <w:rPr>
-          <w:b/>
-          <w:bCs/>
-          <w:color w:val="D86DCB" w:themeColor="accent5" w:themeTint="99"/>
-          <w:sz w:val="32"/>
-          <w:szCs w:val="32"/>
-        </w:rPr>
-        <w:t xml:space="preserve"> create a fresh tween every build</w:t>
+        <w:t>// GOOD, create a fresh tween every build</w:t>
       </w:r>
     </w:p>
     <w:p>
@@ -20939,16 +20792,7 @@
           <w:sz w:val="32"/>
           <w:szCs w:val="32"/>
         </w:rPr>
-        <w:t>child</w:t>
-      </w:r>
-      <w:r>
-        <w:rPr>
-          <w:b/>
-          <w:bCs/>
-          <w:sz w:val="32"/>
-          <w:szCs w:val="32"/>
-        </w:rPr>
-        <w:t>:</w:t>
+        <w:t>child:</w:t>
       </w:r>
       <w:r>
         <w:rPr>
@@ -21197,21 +21041,7 @@
           <w:sz w:val="32"/>
           <w:szCs w:val="32"/>
         </w:rPr>
-        <w:t xml:space="preserve"> creating animations that are too resource-intensive is a common pitfall, especially in lists or </w:t>
-      </w:r>
-      <w:r>
-        <w:rPr>
-          <w:sz w:val="32"/>
-          <w:szCs w:val="32"/>
-        </w:rPr>
-        <w:t>scrollable</w:t>
-      </w:r>
-      <w:r>
-        <w:rPr>
-          <w:sz w:val="32"/>
-          <w:szCs w:val="32"/>
-        </w:rPr>
-        <w:t>.</w:t>
+        <w:t xml:space="preserve"> creating animations that are too resource-intensive is a common pitfall, especially in lists or scrollable.</w:t>
       </w:r>
     </w:p>
     <w:p>
@@ -21289,25 +21119,7 @@
           <w:sz w:val="32"/>
           <w:szCs w:val="32"/>
         </w:rPr>
-        <w:t>Mistake</w:t>
-      </w:r>
-      <w:r>
-        <w:rPr>
-          <w:b/>
-          <w:bCs/>
-          <w:sz w:val="32"/>
-          <w:szCs w:val="32"/>
-        </w:rPr>
-        <w:t>-</w:t>
-      </w:r>
-      <w:r>
-        <w:rPr>
-          <w:b/>
-          <w:bCs/>
-          <w:sz w:val="32"/>
-          <w:szCs w:val="32"/>
-        </w:rPr>
-        <w:t>6</w:t>
+        <w:t>Mistake-6</w:t>
       </w:r>
       <w:r>
         <w:rPr>
@@ -21599,27 +21411,7 @@
           <w:sz w:val="32"/>
           <w:szCs w:val="32"/>
         </w:rPr>
-        <w:t xml:space="preserve"> explicit, </w:t>
-      </w:r>
-      <w:r>
-        <w:rPr>
-          <w:b/>
-          <w:bCs/>
-          <w:color w:val="D86DCB" w:themeColor="accent5" w:themeTint="99"/>
-          <w:sz w:val="32"/>
-          <w:szCs w:val="32"/>
-        </w:rPr>
-        <w:t>we</w:t>
-      </w:r>
-      <w:r>
-        <w:rPr>
-          <w:b/>
-          <w:bCs/>
-          <w:color w:val="D86DCB" w:themeColor="accent5" w:themeTint="99"/>
-          <w:sz w:val="32"/>
-          <w:szCs w:val="32"/>
-        </w:rPr>
-        <w:t xml:space="preserve"> manage the </w:t>
+        <w:t xml:space="preserve"> explicit, we manage the </w:t>
       </w:r>
       <w:proofErr w:type="spellStart"/>
       <w:r>
@@ -22342,17 +22134,7 @@
           <w:sz w:val="32"/>
           <w:szCs w:val="32"/>
         </w:rPr>
-        <w:t xml:space="preserve">      </w:t>
-      </w:r>
-      <w:r>
-        <w:rPr>
-          <w:b/>
-          <w:bCs/>
-          <w:color w:val="D86DCB" w:themeColor="accent5" w:themeTint="99"/>
-          <w:sz w:val="32"/>
-          <w:szCs w:val="32"/>
-        </w:rPr>
-        <w:t>…</w:t>
+        <w:t xml:space="preserve">      …</w:t>
       </w:r>
     </w:p>
     <w:p>
@@ -23083,17 +22865,7 @@
           <w:sz w:val="32"/>
           <w:szCs w:val="32"/>
         </w:rPr>
-        <w:t xml:space="preserve">        </w:t>
-      </w:r>
-      <w:r>
-        <w:rPr>
-          <w:b/>
-          <w:bCs/>
-          <w:color w:val="D86DCB" w:themeColor="accent5" w:themeTint="99"/>
-          <w:sz w:val="32"/>
-          <w:szCs w:val="32"/>
-        </w:rPr>
-        <w:t>…</w:t>
+        <w:t xml:space="preserve">        …</w:t>
       </w:r>
     </w:p>
     <w:p>
@@ -23193,17 +22965,7 @@
           <w:sz w:val="32"/>
           <w:szCs w:val="32"/>
         </w:rPr>
-        <w:t xml:space="preserve">    </w:t>
-      </w:r>
-      <w:r>
-        <w:rPr>
-          <w:b/>
-          <w:bCs/>
-          <w:color w:val="D86DCB" w:themeColor="accent5" w:themeTint="99"/>
-          <w:sz w:val="32"/>
-          <w:szCs w:val="32"/>
-        </w:rPr>
-        <w:t>…</w:t>
+        <w:t xml:space="preserve">    …</w:t>
       </w:r>
     </w:p>
     <w:p>
@@ -23250,16 +23012,7 @@
           <w:sz w:val="32"/>
           <w:szCs w:val="32"/>
         </w:rPr>
-        <w:t>Pattern</w:t>
-      </w:r>
-      <w:r>
-        <w:rPr>
-          <w:b/>
-          <w:bCs/>
-          <w:sz w:val="32"/>
-          <w:szCs w:val="32"/>
-        </w:rPr>
-        <w:t>-2</w:t>
+        <w:t>Pattern-2</w:t>
       </w:r>
       <w:r>
         <w:rPr>
@@ -23423,8 +23176,86 @@
           <w:sz w:val="32"/>
           <w:szCs w:val="32"/>
         </w:rPr>
-        <w:t>begin: 0, end: 1), // fixed values</w:t>
-      </w:r>
+        <w:t>begin: 0, end: 1), // fixed values, animates once on build</w:t>
+      </w:r>
+    </w:p>
+    <w:p>
+      <w:pPr>
+        <w:jc w:val="both"/>
+        <w:rPr>
+          <w:b/>
+          <w:bCs/>
+          <w:color w:val="D86DCB" w:themeColor="accent5" w:themeTint="99"/>
+          <w:sz w:val="32"/>
+          <w:szCs w:val="32"/>
+        </w:rPr>
+      </w:pPr>
+      <w:r>
+        <w:rPr>
+          <w:b/>
+          <w:bCs/>
+          <w:color w:val="D86DCB" w:themeColor="accent5" w:themeTint="99"/>
+          <w:sz w:val="32"/>
+          <w:szCs w:val="32"/>
+        </w:rPr>
+        <w:t xml:space="preserve">  duration: const </w:t>
+      </w:r>
+      <w:proofErr w:type="gramStart"/>
+      <w:r>
+        <w:rPr>
+          <w:b/>
+          <w:bCs/>
+          <w:color w:val="D86DCB" w:themeColor="accent5" w:themeTint="99"/>
+          <w:sz w:val="32"/>
+          <w:szCs w:val="32"/>
+        </w:rPr>
+        <w:t>Duration(</w:t>
+      </w:r>
+      <w:proofErr w:type="gramEnd"/>
+      <w:r>
+        <w:rPr>
+          <w:b/>
+          <w:bCs/>
+          <w:color w:val="D86DCB" w:themeColor="accent5" w:themeTint="99"/>
+          <w:sz w:val="32"/>
+          <w:szCs w:val="32"/>
+        </w:rPr>
+        <w:t>milliseconds: 600),</w:t>
+      </w:r>
+    </w:p>
+    <w:p>
+      <w:pPr>
+        <w:jc w:val="both"/>
+        <w:rPr>
+          <w:b/>
+          <w:bCs/>
+          <w:color w:val="D86DCB" w:themeColor="accent5" w:themeTint="99"/>
+          <w:sz w:val="32"/>
+          <w:szCs w:val="32"/>
+        </w:rPr>
+      </w:pPr>
+      <w:r>
+        <w:rPr>
+          <w:b/>
+          <w:bCs/>
+          <w:color w:val="D86DCB" w:themeColor="accent5" w:themeTint="99"/>
+          <w:sz w:val="32"/>
+          <w:szCs w:val="32"/>
+        </w:rPr>
+        <w:t xml:space="preserve">  curve: </w:t>
+      </w:r>
+      <w:proofErr w:type="spellStart"/>
+      <w:r>
+        <w:rPr>
+          <w:b/>
+          <w:bCs/>
+          <w:color w:val="D86DCB" w:themeColor="accent5" w:themeTint="99"/>
+          <w:sz w:val="32"/>
+          <w:szCs w:val="32"/>
+        </w:rPr>
+        <w:t>Curves.easeOut</w:t>
+      </w:r>
+      <w:proofErr w:type="spellEnd"/>
       <w:r>
         <w:rPr>
           <w:b/>
@@ -23435,37 +23266,93 @@
         </w:rPr>
         <w:t>,</w:t>
       </w:r>
-      <w:r>
-        <w:rPr>
-          <w:b/>
-          <w:bCs/>
-          <w:color w:val="D86DCB" w:themeColor="accent5" w:themeTint="99"/>
-          <w:sz w:val="32"/>
-          <w:szCs w:val="32"/>
-        </w:rPr>
-        <w:t xml:space="preserve"> animates once on build</w:t>
-      </w:r>
-    </w:p>
-    <w:p>
-      <w:pPr>
-        <w:jc w:val="both"/>
-        <w:rPr>
-          <w:b/>
-          <w:bCs/>
-          <w:color w:val="D86DCB" w:themeColor="accent5" w:themeTint="99"/>
-          <w:sz w:val="32"/>
-          <w:szCs w:val="32"/>
-        </w:rPr>
-      </w:pPr>
-      <w:r>
-        <w:rPr>
-          <w:b/>
-          <w:bCs/>
-          <w:color w:val="D86DCB" w:themeColor="accent5" w:themeTint="99"/>
-          <w:sz w:val="32"/>
-          <w:szCs w:val="32"/>
-        </w:rPr>
-        <w:t xml:space="preserve">  duration: const </w:t>
+    </w:p>
+    <w:p>
+      <w:pPr>
+        <w:jc w:val="both"/>
+        <w:rPr>
+          <w:b/>
+          <w:bCs/>
+          <w:color w:val="D86DCB" w:themeColor="accent5" w:themeTint="99"/>
+          <w:sz w:val="32"/>
+          <w:szCs w:val="32"/>
+        </w:rPr>
+      </w:pPr>
+      <w:r>
+        <w:rPr>
+          <w:b/>
+          <w:bCs/>
+          <w:color w:val="D86DCB" w:themeColor="accent5" w:themeTint="99"/>
+          <w:sz w:val="32"/>
+          <w:szCs w:val="32"/>
+        </w:rPr>
+        <w:t xml:space="preserve">  builder: (context, value, child) {</w:t>
+      </w:r>
+    </w:p>
+    <w:p>
+      <w:pPr>
+        <w:jc w:val="both"/>
+        <w:rPr>
+          <w:b/>
+          <w:bCs/>
+          <w:color w:val="D86DCB" w:themeColor="accent5" w:themeTint="99"/>
+          <w:sz w:val="32"/>
+          <w:szCs w:val="32"/>
+        </w:rPr>
+      </w:pPr>
+      <w:r>
+        <w:rPr>
+          <w:b/>
+          <w:bCs/>
+          <w:color w:val="D86DCB" w:themeColor="accent5" w:themeTint="99"/>
+          <w:sz w:val="32"/>
+          <w:szCs w:val="32"/>
+        </w:rPr>
+        <w:t xml:space="preserve">    return </w:t>
+      </w:r>
+      <w:proofErr w:type="spellStart"/>
+      <w:r>
+        <w:rPr>
+          <w:b/>
+          <w:bCs/>
+          <w:color w:val="D86DCB" w:themeColor="accent5" w:themeTint="99"/>
+          <w:sz w:val="32"/>
+          <w:szCs w:val="32"/>
+        </w:rPr>
+        <w:t>Transform.translate</w:t>
+      </w:r>
+      <w:proofErr w:type="spellEnd"/>
+      <w:r>
+        <w:rPr>
+          <w:b/>
+          <w:bCs/>
+          <w:color w:val="D86DCB" w:themeColor="accent5" w:themeTint="99"/>
+          <w:sz w:val="32"/>
+          <w:szCs w:val="32"/>
+        </w:rPr>
+        <w:t>(</w:t>
+      </w:r>
+    </w:p>
+    <w:p>
+      <w:pPr>
+        <w:jc w:val="both"/>
+        <w:rPr>
+          <w:b/>
+          <w:bCs/>
+          <w:color w:val="D86DCB" w:themeColor="accent5" w:themeTint="99"/>
+          <w:sz w:val="32"/>
+          <w:szCs w:val="32"/>
+        </w:rPr>
+      </w:pPr>
+      <w:r>
+        <w:rPr>
+          <w:b/>
+          <w:bCs/>
+          <w:color w:val="D86DCB" w:themeColor="accent5" w:themeTint="99"/>
+          <w:sz w:val="32"/>
+          <w:szCs w:val="32"/>
+        </w:rPr>
+        <w:t xml:space="preserve">      offset: </w:t>
       </w:r>
       <w:proofErr w:type="gramStart"/>
       <w:r>
@@ -23476,7 +23363,7 @@
           <w:sz w:val="32"/>
           <w:szCs w:val="32"/>
         </w:rPr>
-        <w:t>Duration(</w:t>
+        <w:t>Offset(</w:t>
       </w:r>
       <w:proofErr w:type="gramEnd"/>
       <w:r>
@@ -23487,139 +23374,29 @@
           <w:sz w:val="32"/>
           <w:szCs w:val="32"/>
         </w:rPr>
-        <w:t>milliseconds: 600),</w:t>
-      </w:r>
-    </w:p>
-    <w:p>
-      <w:pPr>
-        <w:jc w:val="both"/>
-        <w:rPr>
-          <w:b/>
-          <w:bCs/>
-          <w:color w:val="D86DCB" w:themeColor="accent5" w:themeTint="99"/>
-          <w:sz w:val="32"/>
-          <w:szCs w:val="32"/>
-        </w:rPr>
-      </w:pPr>
-      <w:r>
-        <w:rPr>
-          <w:b/>
-          <w:bCs/>
-          <w:color w:val="D86DCB" w:themeColor="accent5" w:themeTint="99"/>
-          <w:sz w:val="32"/>
-          <w:szCs w:val="32"/>
-        </w:rPr>
-        <w:t xml:space="preserve">  curve: </w:t>
-      </w:r>
-      <w:proofErr w:type="spellStart"/>
-      <w:r>
-        <w:rPr>
-          <w:b/>
-          <w:bCs/>
-          <w:color w:val="D86DCB" w:themeColor="accent5" w:themeTint="99"/>
-          <w:sz w:val="32"/>
-          <w:szCs w:val="32"/>
-        </w:rPr>
-        <w:t>Curves.easeOut</w:t>
-      </w:r>
-      <w:proofErr w:type="spellEnd"/>
-      <w:r>
-        <w:rPr>
-          <w:b/>
-          <w:bCs/>
-          <w:color w:val="D86DCB" w:themeColor="accent5" w:themeTint="99"/>
-          <w:sz w:val="32"/>
-          <w:szCs w:val="32"/>
-        </w:rPr>
-        <w:t>,</w:t>
-      </w:r>
-    </w:p>
-    <w:p>
-      <w:pPr>
-        <w:jc w:val="both"/>
-        <w:rPr>
-          <w:b/>
-          <w:bCs/>
-          <w:color w:val="D86DCB" w:themeColor="accent5" w:themeTint="99"/>
-          <w:sz w:val="32"/>
-          <w:szCs w:val="32"/>
-        </w:rPr>
-      </w:pPr>
-      <w:r>
-        <w:rPr>
-          <w:b/>
-          <w:bCs/>
-          <w:color w:val="D86DCB" w:themeColor="accent5" w:themeTint="99"/>
-          <w:sz w:val="32"/>
-          <w:szCs w:val="32"/>
-        </w:rPr>
-        <w:t xml:space="preserve">  builder: (context, value, child) {</w:t>
-      </w:r>
-    </w:p>
-    <w:p>
-      <w:pPr>
-        <w:jc w:val="both"/>
-        <w:rPr>
-          <w:b/>
-          <w:bCs/>
-          <w:color w:val="D86DCB" w:themeColor="accent5" w:themeTint="99"/>
-          <w:sz w:val="32"/>
-          <w:szCs w:val="32"/>
-        </w:rPr>
-      </w:pPr>
-      <w:r>
-        <w:rPr>
-          <w:b/>
-          <w:bCs/>
-          <w:color w:val="D86DCB" w:themeColor="accent5" w:themeTint="99"/>
-          <w:sz w:val="32"/>
-          <w:szCs w:val="32"/>
-        </w:rPr>
-        <w:t xml:space="preserve">    return </w:t>
-      </w:r>
-      <w:proofErr w:type="spellStart"/>
-      <w:r>
-        <w:rPr>
-          <w:b/>
-          <w:bCs/>
-          <w:color w:val="D86DCB" w:themeColor="accent5" w:themeTint="99"/>
-          <w:sz w:val="32"/>
-          <w:szCs w:val="32"/>
-        </w:rPr>
-        <w:t>Transform.translate</w:t>
-      </w:r>
-      <w:proofErr w:type="spellEnd"/>
-      <w:r>
-        <w:rPr>
-          <w:b/>
-          <w:bCs/>
-          <w:color w:val="D86DCB" w:themeColor="accent5" w:themeTint="99"/>
-          <w:sz w:val="32"/>
-          <w:szCs w:val="32"/>
-        </w:rPr>
-        <w:t>(</w:t>
-      </w:r>
-    </w:p>
-    <w:p>
-      <w:pPr>
-        <w:jc w:val="both"/>
-        <w:rPr>
-          <w:b/>
-          <w:bCs/>
-          <w:color w:val="D86DCB" w:themeColor="accent5" w:themeTint="99"/>
-          <w:sz w:val="32"/>
-          <w:szCs w:val="32"/>
-        </w:rPr>
-      </w:pPr>
-      <w:r>
-        <w:rPr>
-          <w:b/>
-          <w:bCs/>
-          <w:color w:val="D86DCB" w:themeColor="accent5" w:themeTint="99"/>
-          <w:sz w:val="32"/>
-          <w:szCs w:val="32"/>
-        </w:rPr>
-        <w:t xml:space="preserve">      offset: </w:t>
+        <w:t>0, 30 * (1 - value)), // slide up</w:t>
+      </w:r>
+    </w:p>
+    <w:p>
+      <w:pPr>
+        <w:jc w:val="both"/>
+        <w:rPr>
+          <w:b/>
+          <w:bCs/>
+          <w:color w:val="D86DCB" w:themeColor="accent5" w:themeTint="99"/>
+          <w:sz w:val="32"/>
+          <w:szCs w:val="32"/>
+        </w:rPr>
+      </w:pPr>
+      <w:r>
+        <w:rPr>
+          <w:b/>
+          <w:bCs/>
+          <w:color w:val="D86DCB" w:themeColor="accent5" w:themeTint="99"/>
+          <w:sz w:val="32"/>
+          <w:szCs w:val="32"/>
+        </w:rPr>
+        <w:t xml:space="preserve">      child: </w:t>
       </w:r>
       <w:proofErr w:type="gramStart"/>
       <w:r>
@@ -23630,7 +23407,7 @@
           <w:sz w:val="32"/>
           <w:szCs w:val="32"/>
         </w:rPr>
-        <w:t>Offset(</w:t>
+        <w:t>Opacity(</w:t>
       </w:r>
       <w:proofErr w:type="gramEnd"/>
       <w:r>
@@ -23641,50 +23418,6 @@
           <w:sz w:val="32"/>
           <w:szCs w:val="32"/>
         </w:rPr>
-        <w:t>0, 30 * (1 - value)), // slide up</w:t>
-      </w:r>
-    </w:p>
-    <w:p>
-      <w:pPr>
-        <w:jc w:val="both"/>
-        <w:rPr>
-          <w:b/>
-          <w:bCs/>
-          <w:color w:val="D86DCB" w:themeColor="accent5" w:themeTint="99"/>
-          <w:sz w:val="32"/>
-          <w:szCs w:val="32"/>
-        </w:rPr>
-      </w:pPr>
-      <w:r>
-        <w:rPr>
-          <w:b/>
-          <w:bCs/>
-          <w:color w:val="D86DCB" w:themeColor="accent5" w:themeTint="99"/>
-          <w:sz w:val="32"/>
-          <w:szCs w:val="32"/>
-        </w:rPr>
-        <w:t xml:space="preserve">      child: </w:t>
-      </w:r>
-      <w:proofErr w:type="gramStart"/>
-      <w:r>
-        <w:rPr>
-          <w:b/>
-          <w:bCs/>
-          <w:color w:val="D86DCB" w:themeColor="accent5" w:themeTint="99"/>
-          <w:sz w:val="32"/>
-          <w:szCs w:val="32"/>
-        </w:rPr>
-        <w:t>Opacity(</w:t>
-      </w:r>
-      <w:proofErr w:type="gramEnd"/>
-      <w:r>
-        <w:rPr>
-          <w:b/>
-          <w:bCs/>
-          <w:color w:val="D86DCB" w:themeColor="accent5" w:themeTint="99"/>
-          <w:sz w:val="32"/>
-          <w:szCs w:val="32"/>
-        </w:rPr>
         <w:t>opacity: value, child: child),</w:t>
       </w:r>
     </w:p>
@@ -23707,17 +23440,7 @@
           <w:sz w:val="32"/>
           <w:szCs w:val="32"/>
         </w:rPr>
-        <w:t xml:space="preserve">    </w:t>
-      </w:r>
-      <w:r>
-        <w:rPr>
-          <w:b/>
-          <w:bCs/>
-          <w:color w:val="D86DCB" w:themeColor="accent5" w:themeTint="99"/>
-          <w:sz w:val="32"/>
-          <w:szCs w:val="32"/>
-        </w:rPr>
-        <w:t>…</w:t>
+        <w:t xml:space="preserve">    …</w:t>
       </w:r>
     </w:p>
     <w:p>
@@ -23853,25 +23576,7 @@
           <w:sz w:val="32"/>
           <w:szCs w:val="32"/>
         </w:rPr>
-        <w:t>Pattern</w:t>
-      </w:r>
-      <w:r>
-        <w:rPr>
-          <w:b/>
-          <w:bCs/>
-          <w:sz w:val="32"/>
-          <w:szCs w:val="32"/>
-        </w:rPr>
-        <w:t>-</w:t>
-      </w:r>
-      <w:r>
-        <w:rPr>
-          <w:b/>
-          <w:bCs/>
-          <w:sz w:val="32"/>
-          <w:szCs w:val="32"/>
-        </w:rPr>
-        <w:t>3</w:t>
+        <w:t>Pattern-3</w:t>
       </w:r>
       <w:r>
         <w:rPr>
@@ -23918,16 +23623,7 @@
           <w:sz w:val="32"/>
           <w:szCs w:val="32"/>
         </w:rPr>
-        <w:t>&gt;</w:t>
-      </w:r>
-      <w:r>
-        <w:rPr>
-          <w:b/>
-          <w:bCs/>
-          <w:sz w:val="32"/>
-          <w:szCs w:val="32"/>
-        </w:rPr>
-        <w:t>(</w:t>
+        <w:t>&gt;(</w:t>
       </w:r>
       <w:proofErr w:type="gramEnd"/>
       <w:r>
@@ -51949,6 +51645,7 @@
   <w:style w:type="character" w:default="1" w:styleId="DefaultParagraphFont">
     <w:name w:val="Default Paragraph Font"/>
     <w:uiPriority w:val="1"/>
+    <w:semiHidden/>
     <w:unhideWhenUsed/>
   </w:style>
   <w:style w:type="table" w:default="1" w:styleId="TableNormal">

</xml_diff>